<commit_message>
add select, overview test, and pseudo-rule samples
</commit_message>
<xml_diff>
--- a/course/docs/bash_report.docx
+++ b/course/docs/bash_report.docx
@@ -114,7 +114,7 @@
           <w:bCs w:val="1"/>
           <w:rtl w:val="0"/>
         </w:rPr>
-        <w:t xml:space="preserve">«Разработка парсера языка Bash</w:t>
+        <w:t xml:space="preserve">«Разработка синтаксического анализатора языка Bash</w:t>
       </w:r>
       <w:r>
         <w:rPr>
@@ -383,7 +383,7 @@
     </w:p>
     <w:sdt>
       <w:sdtPr>
-        <w:id w:val="323723485"/>
+        <w:id w:val="1792319589"/>
         <w:docPartObj>
           <w:docPartGallery w:val="Table of Contents"/>
           <w:docPartUnique w:val="1"/>
@@ -3002,12 +3002,12 @@
           <wp:inline distB="114300" distT="114300" distL="114300" distR="114300">
             <wp:extent cx="5940115" cy="5803900"/>
             <wp:effectExtent b="0" l="0" r="0" t="0"/>
-            <wp:docPr id="7" name="image12.png"/>
+            <wp:docPr id="7" name="image6.png"/>
             <a:graphic>
               <a:graphicData uri="http://schemas.openxmlformats.org/drawingml/2006/picture">
                 <pic:pic>
                   <pic:nvPicPr>
-                    <pic:cNvPr id="0" name="image12.png"/>
+                    <pic:cNvPr id="0" name="image6.png"/>
                     <pic:cNvPicPr preferRelativeResize="0"/>
                   </pic:nvPicPr>
                   <pic:blipFill>
@@ -3133,12 +3133,12 @@
           <wp:inline distB="114300" distT="114300" distL="114300" distR="114300">
             <wp:extent cx="5940115" cy="5575300"/>
             <wp:effectExtent b="0" l="0" r="0" t="0"/>
-            <wp:docPr id="13" name="image16.png"/>
+            <wp:docPr id="13" name="image13.png"/>
             <a:graphic>
               <a:graphicData uri="http://schemas.openxmlformats.org/drawingml/2006/picture">
                 <pic:pic>
                   <pic:nvPicPr>
-                    <pic:cNvPr id="0" name="image16.png"/>
+                    <pic:cNvPr id="0" name="image13.png"/>
                     <pic:cNvPicPr preferRelativeResize="0"/>
                   </pic:nvPicPr>
                   <pic:blipFill>
@@ -3222,12 +3222,12 @@
           <wp:inline distB="114300" distT="114300" distL="114300" distR="114300">
             <wp:extent cx="5940115" cy="6286500"/>
             <wp:effectExtent b="0" l="0" r="0" t="0"/>
-            <wp:docPr id="2" name="image13.png"/>
+            <wp:docPr id="2" name="image2.png"/>
             <a:graphic>
               <a:graphicData uri="http://schemas.openxmlformats.org/drawingml/2006/picture">
                 <pic:pic>
                   <pic:nvPicPr>
-                    <pic:cNvPr id="0" name="image13.png"/>
+                    <pic:cNvPr id="0" name="image2.png"/>
                     <pic:cNvPicPr preferRelativeResize="0"/>
                   </pic:nvPicPr>
                   <pic:blipFill>
@@ -3298,12 +3298,12 @@
           <wp:inline distB="114300" distT="114300" distL="114300" distR="114300">
             <wp:extent cx="5940115" cy="5524500"/>
             <wp:effectExtent b="0" l="0" r="0" t="0"/>
-            <wp:docPr id="16" name="image1.png"/>
+            <wp:docPr id="16" name="image16.png"/>
             <a:graphic>
               <a:graphicData uri="http://schemas.openxmlformats.org/drawingml/2006/picture">
                 <pic:pic>
                   <pic:nvPicPr>
-                    <pic:cNvPr id="0" name="image1.png"/>
+                    <pic:cNvPr id="0" name="image16.png"/>
                     <pic:cNvPicPr preferRelativeResize="0"/>
                   </pic:nvPicPr>
                   <pic:blipFill>
@@ -3385,12 +3385,12 @@
           <wp:inline distB="114300" distT="114300" distL="114300" distR="114300">
             <wp:extent cx="5940115" cy="3835400"/>
             <wp:effectExtent b="0" l="0" r="0" t="0"/>
-            <wp:docPr id="6" name="image2.png"/>
+            <wp:docPr id="6" name="image7.png"/>
             <a:graphic>
               <a:graphicData uri="http://schemas.openxmlformats.org/drawingml/2006/picture">
                 <pic:pic>
                   <pic:nvPicPr>
-                    <pic:cNvPr id="0" name="image2.png"/>
+                    <pic:cNvPr id="0" name="image7.png"/>
                     <pic:cNvPicPr preferRelativeResize="0"/>
                   </pic:nvPicPr>
                   <pic:blipFill>
@@ -3471,12 +3471,12 @@
           <wp:inline distB="114300" distT="114300" distL="114300" distR="114300">
             <wp:extent cx="5940115" cy="6464300"/>
             <wp:effectExtent b="0" l="0" r="0" t="0"/>
-            <wp:docPr id="3" name="image7.png"/>
+            <wp:docPr id="3" name="image4.png"/>
             <a:graphic>
               <a:graphicData uri="http://schemas.openxmlformats.org/drawingml/2006/picture">
                 <pic:pic>
                   <pic:nvPicPr>
-                    <pic:cNvPr id="0" name="image7.png"/>
+                    <pic:cNvPr id="0" name="image4.png"/>
                     <pic:cNvPicPr preferRelativeResize="0"/>
                   </pic:nvPicPr>
                   <pic:blipFill>
@@ -3568,12 +3568,12 @@
           <wp:inline distB="114300" distT="114300" distL="114300" distR="114300">
             <wp:extent cx="5940115" cy="4368800"/>
             <wp:effectExtent b="0" l="0" r="0" t="0"/>
-            <wp:docPr id="1" name="image9.png"/>
+            <wp:docPr id="1" name="image1.png"/>
             <a:graphic>
               <a:graphicData uri="http://schemas.openxmlformats.org/drawingml/2006/picture">
                 <pic:pic>
                   <pic:nvPicPr>
-                    <pic:cNvPr id="0" name="image9.png"/>
+                    <pic:cNvPr id="0" name="image1.png"/>
                     <pic:cNvPicPr preferRelativeResize="0"/>
                   </pic:nvPicPr>
                   <pic:blipFill>
@@ -3666,12 +3666,12 @@
           <wp:inline distB="114300" distT="114300" distL="114300" distR="114300">
             <wp:extent cx="5940115" cy="3987800"/>
             <wp:effectExtent b="0" l="0" r="0" t="0"/>
-            <wp:docPr id="11" name="image4.png"/>
+            <wp:docPr id="11" name="image12.png"/>
             <a:graphic>
               <a:graphicData uri="http://schemas.openxmlformats.org/drawingml/2006/picture">
                 <pic:pic>
                   <pic:nvPicPr>
-                    <pic:cNvPr id="0" name="image4.png"/>
+                    <pic:cNvPr id="0" name="image12.png"/>
                     <pic:cNvPicPr preferRelativeResize="0"/>
                   </pic:nvPicPr>
                   <pic:blipFill>
@@ -3804,28 +3804,7 @@
         <w:rPr>
           <w:rtl w:val="0"/>
         </w:rPr>
-        <w:t xml:space="preserve">Спорные места сняты правилами, без %left и %right. Перевод строки заканчивает команду через separator, а лишние переводы после &amp;&amp;, || и | забирает nl_opt. FOO=1 — это assignment, echo FOO=1 — команда с аргументом. Подстановка начинается с $( и со скобкой функции не пересекается.</w:t>
-      </w:r>
-    </w:p>
-    <w:p>
-      <w:pPr>
-        <w:rPr/>
-      </w:pPr>
-      <w:r>
-        <w:rPr>
-          <w:rtl w:val="0"/>
-        </w:rPr>
-      </w:r>
-    </w:p>
-    <w:p>
-      <w:pPr>
-        <w:rPr/>
-      </w:pPr>
-      <w:r>
-        <w:rPr>
-          <w:rtl w:val="0"/>
-        </w:rPr>
-        <w:t xml:space="preserve">Один конфликт оставлен в local. Аргументы показаны на рисунке 8: имя, a= или a= со значением. Спорный текст — на рисунке 9: между a= и b стоит пробел.</w:t>
+        <w:t xml:space="preserve">Один конфликт в local. Аргументы показаны на рисунке 8: имя, a= или a= со значением. Спорный текст — на рисунке 9: между a= и b стоит пробел.</w:t>
       </w:r>
       <w:r>
         <w:rPr>
@@ -3915,7 +3894,7 @@
         <w:rPr>
           <w:rtl w:val="0"/>
         </w:rPr>
-        <w:t xml:space="preserve">Сканер его выбрасывает, и парсер видит ASSIGN (a=) и следом ID (b). Сдвиг читает b как значение: один аргумент. Свёртка заканчивает пустое a= и берёт b как следующее имя: два аргумента. Оба варианта этот текст принимают, bison выбирает сдвиг, и ответ программы не меняется. Без пробела, в local a=b, сканер возвращает одну лексему ASSIGN.</w:t>
+        <w:t xml:space="preserve">Сканер пробел выбрасывает, и парсер видит ASSIGN (a=) и следом ID (b). Дальше два хода.</w:t>
       </w:r>
     </w:p>
     <w:p>
@@ -3927,6 +3906,7 @@
         <w:rPr>
           <w:rtl w:val="0"/>
         </w:rPr>
+        <w:t xml:space="preserve">Сдвиг читает b как значение по правилу ASSIGN word: один аргумент.</w:t>
       </w:r>
     </w:p>
     <w:p>
@@ -3938,7 +3918,53 @@
         <w:rPr>
           <w:rtl w:val="0"/>
         </w:rPr>
-        <w:t xml:space="preserve">На рисунке 10 сверху сборка без -Wcounterexamples, снизу тот же конфликт с этим ключом.</w:t>
+        <w:t xml:space="preserve">Свёртка закрывает пустое a= по правилу ASSIGN и берёт b как следующее имя: два аргумента.</w:t>
+      </w:r>
+    </w:p>
+    <w:p>
+      <w:pPr>
+        <w:ind w:firstLine="720"/>
+        <w:rPr/>
+      </w:pPr>
+      <w:r>
+        <w:rPr>
+          <w:rtl w:val="0"/>
+        </w:rPr>
+      </w:r>
+    </w:p>
+    <w:p>
+      <w:pPr>
+        <w:ind w:firstLine="720"/>
+        <w:rPr/>
+      </w:pPr>
+      <w:r>
+        <w:rPr>
+          <w:rtl w:val="0"/>
+        </w:rPr>
+        <w:t xml:space="preserve">Оба хода этот текст принимают. Bison в таком споре всегда выбирает сдвиг, поэтому программа отвечает одинаково и править грамматику незачем. Без пробела, в local a=b, сканер отдаёт одну лексему ASSIGN, и спора нет.</w:t>
+      </w:r>
+    </w:p>
+    <w:p>
+      <w:pPr>
+        <w:ind w:firstLine="720"/>
+        <w:rPr/>
+      </w:pPr>
+      <w:r>
+        <w:rPr>
+          <w:rtl w:val="0"/>
+        </w:rPr>
+      </w:r>
+    </w:p>
+    <w:p>
+      <w:pPr>
+        <w:ind w:firstLine="720"/>
+        <w:rPr/>
+      </w:pPr>
+      <w:r>
+        <w:rPr>
+          <w:rtl w:val="0"/>
+        </w:rPr>
+        <w:t xml:space="preserve">На рисунке 10 сверху сборка без -Wcounterexamples, снизу тот же конфликт с этим флагом.</w:t>
       </w:r>
     </w:p>
     <w:p>
@@ -3952,12 +3978,12 @@
           <wp:inline distB="114300" distT="114300" distL="114300" distR="114300">
             <wp:extent cx="5940115" cy="3098800"/>
             <wp:effectExtent b="0" l="0" r="0" t="0"/>
-            <wp:docPr id="10" name="image3.png"/>
+            <wp:docPr id="10" name="image10.png"/>
             <a:graphic>
               <a:graphicData uri="http://schemas.openxmlformats.org/drawingml/2006/picture">
                 <pic:pic>
                   <pic:nvPicPr>
-                    <pic:cNvPr id="0" name="image3.png"/>
+                    <pic:cNvPr id="0" name="image10.png"/>
                     <pic:cNvPicPr preferRelativeResize="0"/>
                   </pic:nvPicPr>
                   <pic:blipFill>
@@ -4042,7 +4068,6 @@
         <w:rPr>
           <w:rtl w:val="0"/>
         </w:rPr>
-        <w:t xml:space="preserve">Директива %prec могла бы выбрать одну из веток и убрать предупреждение, но не используется: оба разбора принимают один и тот же текст, а пробел между a= и b теряется ещё в сканере. Директива %expect не используется: в POSIX Yacc её нет, а сборка идёт с ключом -y.</w:t>
       </w:r>
     </w:p>
     <w:p>
@@ -4176,12 +4201,12 @@
           <wp:inline distB="114300" distT="114300" distL="114300" distR="114300">
             <wp:extent cx="5940115" cy="2298700"/>
             <wp:effectExtent b="0" l="0" r="0" t="0"/>
-            <wp:docPr id="4" name="image6.png"/>
+            <wp:docPr id="4" name="image3.png"/>
             <a:graphic>
               <a:graphicData uri="http://schemas.openxmlformats.org/drawingml/2006/picture">
                 <pic:pic>
                   <pic:nvPicPr>
-                    <pic:cNvPr id="0" name="image6.png"/>
+                    <pic:cNvPr id="0" name="image3.png"/>
                     <pic:cNvPicPr preferRelativeResize="0"/>
                   </pic:nvPicPr>
                   <pic:blipFill>
@@ -4224,12 +4249,12 @@
           <wp:inline distB="114300" distT="114300" distL="114300" distR="114300">
             <wp:extent cx="5940115" cy="1981200"/>
             <wp:effectExtent b="0" l="0" r="0" t="0"/>
-            <wp:docPr id="5" name="image15.png"/>
+            <wp:docPr id="5" name="image5.png"/>
             <a:graphic>
               <a:graphicData uri="http://schemas.openxmlformats.org/drawingml/2006/picture">
                 <pic:pic>
                   <pic:nvPicPr>
-                    <pic:cNvPr id="0" name="image15.png"/>
+                    <pic:cNvPr id="0" name="image5.png"/>
                     <pic:cNvPicPr preferRelativeResize="0"/>
                   </pic:nvPicPr>
                   <pic:blipFill>
@@ -4323,12 +4348,12 @@
           <wp:inline distB="114300" distT="114300" distL="114300" distR="114300">
             <wp:extent cx="5940115" cy="1346200"/>
             <wp:effectExtent b="0" l="0" r="0" t="0"/>
-            <wp:docPr id="15" name="image11.png"/>
+            <wp:docPr id="15" name="image15.png"/>
             <a:graphic>
               <a:graphicData uri="http://schemas.openxmlformats.org/drawingml/2006/picture">
                 <pic:pic>
                   <pic:nvPicPr>
-                    <pic:cNvPr id="0" name="image11.png"/>
+                    <pic:cNvPr id="0" name="image15.png"/>
                     <pic:cNvPicPr preferRelativeResize="0"/>
                   </pic:nvPicPr>
                   <pic:blipFill>
@@ -4603,12 +4628,12 @@
           <wp:inline distB="114300" distT="114300" distL="114300" distR="114300">
             <wp:extent cx="5940115" cy="1536700"/>
             <wp:effectExtent b="0" l="0" r="0" t="0"/>
-            <wp:docPr id="12" name="image10.png"/>
+            <wp:docPr id="12" name="image11.png"/>
             <a:graphic>
               <a:graphicData uri="http://schemas.openxmlformats.org/drawingml/2006/picture">
                 <pic:pic>
                   <pic:nvPicPr>
-                    <pic:cNvPr id="0" name="image10.png"/>
+                    <pic:cNvPr id="0" name="image11.png"/>
                     <pic:cNvPicPr preferRelativeResize="0"/>
                   </pic:nvPicPr>
                   <pic:blipFill>
@@ -4671,12 +4696,12 @@
           <wp:inline distB="114300" distT="114300" distL="114300" distR="114300">
             <wp:extent cx="5940115" cy="3390900"/>
             <wp:effectExtent b="0" l="0" r="0" t="0"/>
-            <wp:docPr id="8" name="image5.png"/>
+            <wp:docPr id="8" name="image9.png"/>
             <a:graphic>
               <a:graphicData uri="http://schemas.openxmlformats.org/drawingml/2006/picture">
                 <pic:pic>
                   <pic:nvPicPr>
-                    <pic:cNvPr id="0" name="image5.png"/>
+                    <pic:cNvPr id="0" name="image9.png"/>
                     <pic:cNvPicPr preferRelativeResize="0"/>
                   </pic:nvPicPr>
                   <pic:blipFill>

</xml_diff>